<commit_message>
feat: complete end-to-end sync of seed data, SQL modules, demo scripts, runbook and Word presentation
</commit_message>
<xml_diff>
--- a/docs/KichBan_ThuyetTrinh_BaoVe_QTDL_MoiNhat.docx
+++ b/docs/KichBan_ThuyetTrinh_BaoVe_QTDL_MoiNhat.docx
@@ -4227,31 +4227,24 @@
               <w:right w:val="none"/>
               <w:bottom w:val="none"/>
             </w:tcBorders>
+            <w:shd w:val="clear" w:color="auto" w:fill="EBF5FB"/>
+            <w:tcMar>
+              <w:top w:w="120" w:type="dxa"/>
+              <w:bottom w:w="120" w:type="dxa"/>
+              <w:left w:w="180" w:type="dxa"/>
+              <w:right w:w="180" w:type="dxa"/>
+            </w:tcMar>
           </w:tcPr>
           <w:p>
-            <w:pPr>
-              <w:spacing w:before="80" w:after="80"/>
-            </w:pPr>
             <w:r>
               <w:rPr>
-                <w:rFonts w:ascii="Calibri" w:hAnsi="Calibri"/>
-                <w:b/>
-                <w:i w:val="0"/>
-                <w:color w:val="D35400"/>
-                <w:sz w:val="21"/>
+                <w:rFonts w:ascii="Segoe UI" w:hAnsi="Segoe UI"/>
+                <w:color w:val="1B4F72"/>
+                <w:sz w:val="20"/>
               </w:rPr>
               <w:t>💡 Ví dụ đời thường (Trợ lý Marketing kích cầu giờ ế và Níu chân khách VIP):</w:t>
               <w:br/>
-            </w:r>
-            <w:r>
-              <w:rPr>
-                <w:rFonts w:ascii="Calibri" w:hAnsi="Calibri"/>
-                <w:b w:val="0"/>
-                <w:i w:val="0"/>
-                <w:color w:val="2C3E50"/>
-                <w:sz w:val="21"/>
-              </w:rPr>
-              <w:t>Khung giờ 0h đêm và 16h chiều quán vắng khách, máy bỏ trống nhiều. Khách VIP Bùi Minh Quân (đã tiêu hơn 600k) nhưng 3 ngày rồi không thấy ghé chơi. Module AI 5 tự động khai phá Materialized Views để đề xuất: Giảm giá 25% tiền giờ Happy Hour và Tự động gửi SMS tặng Voucher 30k + lon nước ngọt miễn phí giữ chân khách VIP.</w:t>
+              <w:t>Khung giờ 0h đêm và 16h chiều quán vắng khách, máy bỏ trống nhiều. Khách hàng VIP Nguyễn Việt Anh (SĐT: 0327469105, đã nạp và chơi hơn 700.000 VNĐ) nhưng 4 ngày rồi chưa quay lại quán. Module AI 5 tự động khai phá Materialized Views để: 1. Đề xuất giảm 25% tiền giờ Happy Hour khung vắng khách; 2. Tự động gửi SMS tặng Voucher 30.000 VNĐ kèm đồ uống miễn phí thẳng về điện thoại của Nguyễn Việt Anh.</w:t>
             </w:r>
           </w:p>
         </w:tc>
@@ -4705,18 +4698,8 @@
             <w:shd w:fill="FFFFFF"/>
           </w:tcPr>
           <w:p>
-            <w:pPr>
-              <w:spacing w:before="60" w:after="60"/>
-            </w:pPr>
             <w:r>
-              <w:rPr>
-                <w:rFonts w:ascii="Calibri" w:hAnsi="Calibri"/>
-                <w:b w:val="0"/>
-                <w:i w:val="0"/>
-                <w:color w:val="2C3E50"/>
-                <w:sz w:val="19"/>
-              </w:rPr>
-              <w:t>Khách hàng: Bùi Minh Quân (ID 8)</w:t>
+              <w:t>Khách hàng: Nguyễn Việt Anh (ID 31 - SĐT: 0327469105)</w:t>
             </w:r>
           </w:p>
         </w:tc>
@@ -4769,6 +4752,126 @@
         <w:spacing w:after="80"/>
       </w:pPr>
     </w:p>
+    <w:p/>
+    <w:tbl>
+      <w:tblPr>
+        <w:tblW w:type="auto" w:w="0"/>
+        <w:tblLook w:firstColumn="1" w:firstRow="1" w:lastColumn="0" w:lastRow="0" w:noHBand="0" w:noVBand="1" w:val="04A0"/>
+      </w:tblPr>
+      <w:tblGrid>
+        <w:gridCol w:w="9936"/>
+      </w:tblGrid>
+      <w:tr>
+        <w:tc>
+          <w:tcPr>
+            <w:tcW w:type="dxa" w:w="9936"/>
+            <w:shd w:val="clear" w:color="auto" w:fill="EAFAF1"/>
+            <w:tcMar>
+              <w:top w:w="120" w:type="dxa"/>
+              <w:bottom w:w="120" w:type="dxa"/>
+              <w:left w:w="180" w:type="dxa"/>
+              <w:right w:w="180" w:type="dxa"/>
+            </w:tcMar>
+          </w:tcPr>
+          <w:p>
+            <w:pPr>
+              <w:spacing w:line="276" w:lineRule="auto"/>
+            </w:pPr>
+            <w:r>
+              <w:rPr>
+                <w:rFonts w:ascii="Segoe UI" w:hAnsi="Segoe UI"/>
+                <w:color w:val="145A32"/>
+                <w:sz w:val="20"/>
+              </w:rPr>
+              <w:t>🗣️ Lời thuyết trình [TẠO ĐIỂM NHẤN ĐẶC BIỆT]:</w:t>
+              <w:br/>
+              <w:t>"Thưa Thầy Cô, sau khi AI đưa ra đề xuất, hệ thống cung cấp hàm fn_apply_promotions() để tự động kích hoạt ưu đãi vào bảng khuyến mãi chính thức. Đặc biệt, hệ thống sử dụng PostgreSQL LISTEN/NOTIFY để bắn tín hiệu thời gian thực sang Python SMS Gateway, gửi ngay tin nhắn SMS tặng Voucher 30.000đ về số điện thoại thật của bạn Nguyễn Việt Anh (0327469105). Thầy Cô có thể nhìn thấy tin nhắn rung và nổ thông báo trực tiếp trên màn hình điện thoại ngay trong giây lát!"</w:t>
+            </w:r>
+          </w:p>
+        </w:tc>
+      </w:tr>
+    </w:tbl>
+    <w:tbl>
+      <w:tblPr>
+        <w:tblW w:type="auto" w:w="0"/>
+        <w:tblLook w:firstColumn="1" w:firstRow="1" w:lastColumn="0" w:lastRow="0" w:noHBand="0" w:noVBand="1" w:val="04A0"/>
+      </w:tblPr>
+      <w:tblGrid>
+        <w:gridCol w:w="9936"/>
+      </w:tblGrid>
+      <w:tr>
+        <w:tc>
+          <w:tcPr>
+            <w:tcW w:type="dxa" w:w="9936"/>
+            <w:shd w:val="clear" w:color="auto" w:fill="1E1E1E"/>
+            <w:tcMar>
+              <w:top w:w="120" w:type="dxa"/>
+              <w:bottom w:w="120" w:type="dxa"/>
+              <w:left w:w="180" w:type="dxa"/>
+              <w:right w:w="180" w:type="dxa"/>
+            </w:tcMar>
+          </w:tcPr>
+          <w:p>
+            <w:pPr>
+              <w:spacing w:line="276" w:lineRule="auto"/>
+            </w:pPr>
+            <w:r>
+              <w:rPr>
+                <w:rFonts w:ascii="Consolas" w:hAnsi="Consolas"/>
+                <w:b/>
+                <w:color w:val="4EC9B0"/>
+                <w:sz w:val="19"/>
+              </w:rPr>
+              <w:t>-- [ BƯỚC 1: BẬT TERMINAL PYTHON LẮNG NGHE SMS ] --</w:t>
+              <w:br/>
+            </w:r>
+            <w:r>
+              <w:rPr>
+                <w:rFonts w:ascii="Consolas" w:hAnsi="Consolas"/>
+                <w:color w:val="DCDCDC"/>
+                <w:sz w:val="19"/>
+              </w:rPr>
+              <w:t>python python/sms_gateway_listener.py</w:t>
+              <w:br/>
+              <w:t># Mở link https://ntfy.sh/netcafe_vietanh trên điện thoại để đón tin nhắn thật</w:t>
+              <w:br/>
+              <w:br/>
+            </w:r>
+            <w:r>
+              <w:rPr>
+                <w:rFonts w:ascii="Consolas" w:hAnsi="Consolas"/>
+                <w:b/>
+                <w:color w:val="4EC9B0"/>
+                <w:sz w:val="19"/>
+              </w:rPr>
+              <w:t>-- [ BƯỚC 2: CHẠY LỆNH ÁP DỤNG TRÊN NEON / DBEAVER ] --</w:t>
+              <w:br/>
+            </w:r>
+            <w:r>
+              <w:rPr>
+                <w:rFonts w:ascii="Consolas" w:hAnsi="Consolas"/>
+                <w:color w:val="DCDCDC"/>
+                <w:sz w:val="19"/>
+              </w:rPr>
+              <w:t>-- 1. Kích hoạt ưu đãi AI &amp; Bắn tin nhắn SMS về máy thật:</w:t>
+              <w:br/>
+              <w:t>SELECT * FROM ai.fn_apply_promotions();</w:t>
+              <w:br/>
+              <w:br/>
+              <w:t>-- 2. Kiểm tra bảng khuyến mãi vừa được AI tự động nạp vào:</w:t>
+              <w:br/>
+              <w:t>SELECT code, promotion_name, value FROM billing.promotion WHERE conditions-&gt;&gt;'auto_created_by_ai' = 'true';</w:t>
+              <w:br/>
+              <w:br/>
+              <w:t>-- 3. Hoàn tác sạch sẽ sau khi trình chiếu:</w:t>
+              <w:br/>
+              <w:t>SELECT * FROM ai.fn_rollback_promotions();</w:t>
+              <w:br/>
+            </w:r>
+          </w:p>
+        </w:tc>
+      </w:tr>
+    </w:tbl>
     <w:p>
       <w:pPr>
         <w:keepNext/>

</xml_diff>

<commit_message>
docs(script): sync updated manager query with issued_at to both docx files
</commit_message>
<xml_diff>
--- a/docs/KichBan_ThuyetTrinh_BaoVe_QTDL_MoiNhat.docx
+++ b/docs/KichBan_ThuyetTrinh_BaoVe_QTDL_MoiNhat.docx
@@ -1490,195 +1490,76 @@
             <w:shd w:val="clear" w:color="auto" w:fill="282C34"/>
           </w:tcPr>
           <w:p>
-            <w:pPr>
-              <w:spacing w:before="60" w:after="60"/>
-              <w:rPr>
-                <w:rFonts w:ascii="Times New Roman" w:hAnsi="Times New Roman" w:cs="Times New Roman"/>
-              </w:rPr>
-            </w:pPr>
-            <w:r>
-              <w:rPr>
-                <w:rFonts w:ascii="Times New Roman" w:hAnsi="Times New Roman" w:cs="Times New Roman"/>
-                <w:b/>
-                <w:color w:val="98C379"/>
-                <w:sz w:val="18"/>
-              </w:rPr>
+            <w:r>
               <w:t>-- [ NEON SQL EDITOR / DBEAVER ] --</w:t>
-            </w:r>
-            <w:r>
-              <w:rPr>
-                <w:rFonts w:ascii="Times New Roman" w:hAnsi="Times New Roman" w:cs="Times New Roman"/>
-                <w:b/>
-                <w:color w:val="98C379"/>
-                <w:sz w:val="18"/>
-              </w:rPr>
               <w:br/>
-            </w:r>
-            <w:r>
-              <w:rPr>
-                <w:rFonts w:ascii="Times New Roman" w:hAnsi="Times New Roman" w:cs="Times New Roman"/>
-                <w:color w:val="E6EBF0"/>
-                <w:sz w:val="19"/>
-              </w:rPr>
               <w:t>-- 1. Đóng vai nhân viên Thảo:</w:t>
-            </w:r>
-            <w:r>
-              <w:rPr>
-                <w:rFonts w:ascii="Times New Roman" w:hAnsi="Times New Roman" w:cs="Times New Roman"/>
-                <w:color w:val="E6EBF0"/>
-                <w:sz w:val="19"/>
-              </w:rPr>
               <w:br/>
               <w:t>SET ROLE nv_thao;</w:t>
-            </w:r>
-            <w:r>
-              <w:rPr>
-                <w:rFonts w:ascii="Times New Roman" w:hAnsi="Times New Roman" w:cs="Times New Roman"/>
-                <w:color w:val="E6EBF0"/>
-                <w:sz w:val="19"/>
-              </w:rPr>
               <w:br/>
-            </w:r>
-            <w:r>
-              <w:rPr>
-                <w:rFonts w:ascii="Times New Roman" w:hAnsi="Times New Roman" w:cs="Times New Roman"/>
-                <w:color w:val="E6EBF0"/>
-                <w:sz w:val="19"/>
-              </w:rPr>
+              <w:t>SELECT 'ĐÃ CHUYỂN THÀNH CÔNG SANG VAI TRÒ THU NGÂN (THẢO)' AS thong_bao_he_thong;</w:t>
+              <w:br/>
               <w:br/>
               <w:t>-- 2. Truy vấn hóa đơn (Chỉ thấy đúng 5 hóa đơn do mình lập):</w:t>
-            </w:r>
-            <w:r>
-              <w:rPr>
-                <w:rFonts w:ascii="Times New Roman" w:hAnsi="Times New Roman" w:cs="Times New Roman"/>
-                <w:color w:val="E6EBF0"/>
-                <w:sz w:val="19"/>
-              </w:rPr>
               <w:br/>
               <w:t xml:space="preserve">SELECT invoice_id, customer_id, cashier_id, total_amount, status </w:t>
-            </w:r>
-            <w:r>
-              <w:rPr>
-                <w:rFonts w:ascii="Times New Roman" w:hAnsi="Times New Roman" w:cs="Times New Roman"/>
-                <w:color w:val="E6EBF0"/>
-                <w:sz w:val="19"/>
-              </w:rPr>
               <w:br/>
               <w:t>FROM billing.invoice;</w:t>
-            </w:r>
-            <w:r>
-              <w:rPr>
-                <w:rFonts w:ascii="Times New Roman" w:hAnsi="Times New Roman" w:cs="Times New Roman"/>
-                <w:color w:val="E6EBF0"/>
-                <w:sz w:val="19"/>
-              </w:rPr>
               <w:br/>
-            </w:r>
-            <w:r>
-              <w:rPr>
-                <w:rFonts w:ascii="Times New Roman" w:hAnsi="Times New Roman" w:cs="Times New Roman"/>
-                <w:color w:val="E6EBF0"/>
-                <w:sz w:val="19"/>
-              </w:rPr>
               <w:br/>
               <w:t>-- 3. Đổi sang vai trò Quản lý (Manager) để đối chiếu (Thấy toàn bộ hóa đơn kèm thông tin nhân sự):</w:t>
-            </w:r>
-            <w:r>
-              <w:rPr>
-                <w:rFonts w:ascii="Times New Roman" w:hAnsi="Times New Roman" w:cs="Times New Roman"/>
-                <w:color w:val="E6EBF0"/>
-                <w:sz w:val="19"/>
-              </w:rPr>
               <w:br/>
               <w:t>RESET ROLE;</w:t>
-            </w:r>
-            <w:r>
-              <w:rPr>
-                <w:rFonts w:ascii="Times New Roman" w:hAnsi="Times New Roman" w:cs="Times New Roman"/>
-                <w:color w:val="E6EBF0"/>
-                <w:sz w:val="19"/>
-              </w:rPr>
               <w:br/>
               <w:t>SET ROLE nv_manager;</w:t>
-            </w:r>
-            <w:r>
-              <w:rPr>
-                <w:rFonts w:ascii="Times New Roman" w:hAnsi="Times New Roman" w:cs="Times New Roman"/>
-                <w:color w:val="E6EBF0"/>
-                <w:sz w:val="19"/>
-              </w:rPr>
+              <w:br/>
+              <w:t>SELECT 'ĐÃ CHUYỂN THÀNH CÔNG SANG VAI TRÒ QUẢN LÝ (MANAGER)' AS thong_bao_he_thong;</w:t>
+              <w:br/>
+              <w:br/>
+              <w:t>-- Quản lý xem toàn bộ chi tiết từng hóa đơn của tất cả nhân viên:</w:t>
               <w:br/>
               <w:t xml:space="preserve">SELECT </w:t>
-            </w:r>
-            <w:r>
-              <w:rPr>
-                <w:rFonts w:ascii="Times New Roman" w:hAnsi="Times New Roman" w:cs="Times New Roman"/>
-                <w:color w:val="E6EBF0"/>
-                <w:sz w:val="19"/>
-              </w:rPr>
+              <w:br/>
+              <w:t xml:space="preserve">    i.invoice_id AS ma_hoa_don,</w:t>
+              <w:br/>
+              <w:t xml:space="preserve">    i.issued_at AS thoi_gian_lap,</w:t>
+              <w:br/>
+              <w:t xml:space="preserve">    i.total_amount AS tong_tien,</w:t>
+              <w:br/>
+              <w:t xml:space="preserve">    i.status AS trang_thai,</w:t>
+              <w:br/>
+              <w:t xml:space="preserve">    i.cashier_id AS ma_nhan_vien,</w:t>
+              <w:br/>
+              <w:t xml:space="preserve">    e.full_name AS ten_nhan_vien_lap,</w:t>
+              <w:br/>
+              <w:t xml:space="preserve">    e.emp_role AS vai_tro_nhan_vien,</w:t>
+              <w:br/>
+              <w:t xml:space="preserve">    e.default_shift AS ca_lam_viec</w:t>
+              <w:br/>
+              <w:t>FROM billing.invoice i</w:t>
+              <w:br/>
+              <w:t>JOIN hr.employee e ON i.cashier_id = e.employee_id</w:t>
+              <w:br/>
+              <w:t>ORDER BY i.invoice_id;</w:t>
+              <w:br/>
+              <w:br/>
+              <w:t>-- Bảng tổng hợp doanh thu theo từng nhân viên ca trực:</w:t>
+              <w:br/>
+              <w:t xml:space="preserve">SELECT </w:t>
               <w:br/>
               <w:t xml:space="preserve">    i.cashier_id, e.full_name AS ten_nhan_vien, e.username AS tai_khoan, e.phone AS so_dien_thoai,</w:t>
-            </w:r>
-            <w:r>
-              <w:rPr>
-                <w:rFonts w:ascii="Times New Roman" w:hAnsi="Times New Roman" w:cs="Times New Roman"/>
-                <w:color w:val="E6EBF0"/>
-                <w:sz w:val="19"/>
-              </w:rPr>
               <w:br/>
               <w:t xml:space="preserve">    e.emp_role AS vai_tro, e.default_shift AS ca_lam_viec, count(i.invoice_id) AS so_luong_hoa_don,</w:t>
-            </w:r>
-            <w:r>
-              <w:rPr>
-                <w:rFonts w:ascii="Times New Roman" w:hAnsi="Times New Roman" w:cs="Times New Roman"/>
-                <w:color w:val="E6EBF0"/>
-                <w:sz w:val="19"/>
-              </w:rPr>
               <w:br/>
               <w:t xml:space="preserve">    sum(i.total_amount) AS tong_doanh_thu</w:t>
-            </w:r>
-            <w:r>
-              <w:rPr>
-                <w:rFonts w:ascii="Times New Roman" w:hAnsi="Times New Roman" w:cs="Times New Roman"/>
-                <w:color w:val="E6EBF0"/>
-                <w:sz w:val="19"/>
-              </w:rPr>
               <w:br/>
               <w:t>FROM billing.invoice i</w:t>
-            </w:r>
-            <w:r>
-              <w:rPr>
-                <w:rFonts w:ascii="Times New Roman" w:hAnsi="Times New Roman" w:cs="Times New Roman"/>
-                <w:color w:val="E6EBF0"/>
-                <w:sz w:val="19"/>
-              </w:rPr>
               <w:br/>
               <w:t>JOIN hr.employee e ON i.cashier_id = e.employee_id</w:t>
-            </w:r>
-            <w:r>
-              <w:rPr>
-                <w:rFonts w:ascii="Times New Roman" w:hAnsi="Times New Roman" w:cs="Times New Roman"/>
-                <w:color w:val="E6EBF0"/>
-                <w:sz w:val="19"/>
-              </w:rPr>
               <w:br/>
               <w:t>GROUP BY i.cashier_id, e.full_name, e.username, e.phone, e.emp_role, e.default_shift</w:t>
-            </w:r>
-            <w:r>
-              <w:rPr>
-                <w:rFonts w:ascii="Times New Roman" w:hAnsi="Times New Roman" w:cs="Times New Roman"/>
-                <w:color w:val="E6EBF0"/>
-                <w:sz w:val="19"/>
-              </w:rPr>
               <w:br/>
               <w:t>ORDER BY i.cashier_id;</w:t>
-            </w:r>
-            <w:r>
-              <w:rPr>
-                <w:rFonts w:ascii="Times New Roman" w:hAnsi="Times New Roman" w:cs="Times New Roman"/>
-                <w:color w:val="E6EBF0"/>
-                <w:sz w:val="19"/>
-              </w:rPr>
               <w:br/>
               <w:t>RESET ROLE;</w:t>
             </w:r>
@@ -3200,115 +3081,30 @@
             <w:shd w:val="clear" w:color="auto" w:fill="282C34"/>
           </w:tcPr>
           <w:p>
-            <w:pPr>
-              <w:spacing w:before="60" w:after="60"/>
-              <w:rPr>
-                <w:rFonts w:ascii="Times New Roman" w:hAnsi="Times New Roman" w:cs="Times New Roman"/>
-              </w:rPr>
-            </w:pPr>
-            <w:r>
-              <w:rPr>
-                <w:rFonts w:ascii="Times New Roman" w:hAnsi="Times New Roman" w:cs="Times New Roman"/>
-                <w:b/>
-                <w:color w:val="98C379"/>
-                <w:sz w:val="18"/>
-              </w:rPr>
+            <w:r>
               <w:t>-- [ NEON SQL EDITOR / DBEAVER ] --</w:t>
-            </w:r>
-            <w:r>
-              <w:rPr>
-                <w:rFonts w:ascii="Times New Roman" w:hAnsi="Times New Roman" w:cs="Times New Roman"/>
-                <w:b/>
-                <w:color w:val="98C379"/>
-                <w:sz w:val="18"/>
-              </w:rPr>
               <w:br/>
-            </w:r>
-            <w:r>
-              <w:rPr>
-                <w:rFonts w:ascii="Times New Roman" w:hAnsi="Times New Roman" w:cs="Times New Roman"/>
-                <w:color w:val="E6EBF0"/>
-                <w:sz w:val="19"/>
-              </w:rPr>
+              <w:t>-- TÙY CHỌN 1 (ĐO TỰ ĐỘNG TRÊN 20.000 DÒNG - HIỂN THỊ TIẾNG VIỆT &amp; TIMING SO SÁNH):</w:t>
+              <w:br/>
+              <w:t xml:space="preserve">SELECT </w:t>
+              <w:br/>
+              <w:t xml:space="preserve">    phuong_thuc, so_dong_du_lieu, thoi_gian_ms, so_block_bo_nho_doc, danh_gia_hieu_nang</w:t>
+              <w:br/>
+              <w:t>FROM ai.fn_compare_index_benchmark();</w:t>
+              <w:br/>
+              <w:br/>
+              <w:t>-- TÙY CHỌN 2 (ĐO THỦ CÔNG TRÊN BẢNG GỐC 9 DÒNG):</w:t>
+              <w:br/>
               <w:t>RESET ROLE;</w:t>
-            </w:r>
-            <w:r>
-              <w:rPr>
-                <w:rFonts w:ascii="Times New Roman" w:hAnsi="Times New Roman" w:cs="Times New Roman"/>
-                <w:color w:val="E6EBF0"/>
-                <w:sz w:val="19"/>
-              </w:rPr>
-              <w:br/>
-            </w:r>
-            <w:r>
-              <w:rPr>
-                <w:rFonts w:ascii="Times New Roman" w:hAnsi="Times New Roman" w:cs="Times New Roman"/>
-                <w:color w:val="E6EBF0"/>
-                <w:sz w:val="19"/>
-              </w:rPr>
-              <w:lastRenderedPageBreak/>
-              <w:br/>
-              <w:t>-- 1. Xóa index cũ để đưa bảng về trạng thái nguyên bản:</w:t>
-            </w:r>
-            <w:r>
-              <w:rPr>
-                <w:rFonts w:ascii="Times New Roman" w:hAnsi="Times New Roman" w:cs="Times New Roman"/>
-                <w:color w:val="E6EBF0"/>
-                <w:sz w:val="19"/>
-              </w:rPr>
               <w:br/>
               <w:t>DROP INDEX IF EXISTS billing.idx_invoice_total_amount;</w:t>
-            </w:r>
-            <w:r>
-              <w:rPr>
-                <w:rFonts w:ascii="Times New Roman" w:hAnsi="Times New Roman" w:cs="Times New Roman"/>
-                <w:color w:val="E6EBF0"/>
-                <w:sz w:val="19"/>
-              </w:rPr>
               <w:br/>
-            </w:r>
-            <w:r>
-              <w:rPr>
-                <w:rFonts w:ascii="Times New Roman" w:hAnsi="Times New Roman" w:cs="Times New Roman"/>
-                <w:color w:val="E6EBF0"/>
-                <w:sz w:val="19"/>
-              </w:rPr>
-              <w:br/>
-              <w:t>-- 2. Chạy EXPLAIN tìm hóa đơn 630.000 VNĐ (Chỉ ra Seq Scan):</w:t>
-            </w:r>
-            <w:r>
-              <w:rPr>
-                <w:rFonts w:ascii="Times New Roman" w:hAnsi="Times New Roman" w:cs="Times New Roman"/>
-                <w:color w:val="E6EBF0"/>
-                <w:sz w:val="19"/>
-              </w:rPr>
               <w:br/>
               <w:t>EXPLAIN (ANALYZE, BUFFERS)</w:t>
-            </w:r>
-            <w:r>
-              <w:rPr>
-                <w:rFonts w:ascii="Times New Roman" w:hAnsi="Times New Roman" w:cs="Times New Roman"/>
-                <w:color w:val="E6EBF0"/>
-                <w:sz w:val="19"/>
-              </w:rPr>
               <w:br/>
               <w:t xml:space="preserve">SELECT invoice_id, customer_id, cashier_id, total_amount, status </w:t>
-            </w:r>
-            <w:r>
-              <w:rPr>
-                <w:rFonts w:ascii="Times New Roman" w:hAnsi="Times New Roman" w:cs="Times New Roman"/>
-                <w:color w:val="E6EBF0"/>
-                <w:sz w:val="19"/>
-              </w:rPr>
               <w:br/>
               <w:t xml:space="preserve">FROM billing.invoice </w:t>
-            </w:r>
-            <w:r>
-              <w:rPr>
-                <w:rFonts w:ascii="Times New Roman" w:hAnsi="Times New Roman" w:cs="Times New Roman"/>
-                <w:color w:val="E6EBF0"/>
-                <w:sz w:val="19"/>
-              </w:rPr>
               <w:br/>
               <w:t>WHERE total_amount = 630000;</w:t>
             </w:r>
@@ -4409,82 +4205,37 @@
             <w:shd w:val="clear" w:color="auto" w:fill="282C34"/>
           </w:tcPr>
           <w:p>
-            <w:pPr>
-              <w:spacing w:before="60" w:after="60"/>
-              <w:rPr>
-                <w:rFonts w:ascii="Times New Roman" w:hAnsi="Times New Roman" w:cs="Times New Roman"/>
-              </w:rPr>
-            </w:pPr>
-            <w:r>
-              <w:rPr>
-                <w:rFonts w:ascii="Times New Roman" w:hAnsi="Times New Roman" w:cs="Times New Roman"/>
-                <w:b/>
-                <w:color w:val="98C379"/>
-                <w:sz w:val="18"/>
-              </w:rPr>
+            <w:r>
               <w:t>-- [ NEON SQL EDITOR / DBEAVER ] --</w:t>
-            </w:r>
-            <w:r>
-              <w:rPr>
-                <w:rFonts w:ascii="Times New Roman" w:hAnsi="Times New Roman" w:cs="Times New Roman"/>
-                <w:b/>
-                <w:color w:val="98C379"/>
-                <w:sz w:val="18"/>
-              </w:rPr>
               <w:br/>
-            </w:r>
-            <w:r>
-              <w:rPr>
-                <w:rFonts w:ascii="Times New Roman" w:hAnsi="Times New Roman" w:cs="Times New Roman"/>
-                <w:color w:val="E6EBF0"/>
-                <w:sz w:val="19"/>
-              </w:rPr>
+              <w:t>-- 1. Bóc tách linh hoạt các trường JSON và lọc đồng thời theo Card RTX, CPU i7 và RAM 32GB:</w:t>
+              <w:br/>
               <w:t>SELECT computer_code, computer_name,</w:t>
-            </w:r>
-            <w:r>
-              <w:rPr>
-                <w:rFonts w:ascii="Times New Roman" w:hAnsi="Times New Roman" w:cs="Times New Roman"/>
-                <w:color w:val="E6EBF0"/>
-                <w:sz w:val="19"/>
-              </w:rPr>
               <w:br/>
               <w:t xml:space="preserve">       specs -&gt;&gt; 'cpu' AS cpu_chip,</w:t>
-            </w:r>
-            <w:r>
-              <w:rPr>
-                <w:rFonts w:ascii="Times New Roman" w:hAnsi="Times New Roman" w:cs="Times New Roman"/>
-                <w:color w:val="E6EBF0"/>
-                <w:sz w:val="19"/>
-              </w:rPr>
               <w:br/>
               <w:t xml:space="preserve">       specs -&gt;&gt; 'gpu' AS card_man_hinh,</w:t>
-            </w:r>
-            <w:r>
-              <w:rPr>
-                <w:rFonts w:ascii="Times New Roman" w:hAnsi="Times New Roman" w:cs="Times New Roman"/>
-                <w:color w:val="E6EBF0"/>
-                <w:sz w:val="19"/>
-              </w:rPr>
               <w:br/>
               <w:t xml:space="preserve">       specs -&gt;&gt; 'ram' AS dung_luong_ram</w:t>
-            </w:r>
-            <w:r>
-              <w:rPr>
-                <w:rFonts w:ascii="Times New Roman" w:hAnsi="Times New Roman" w:cs="Times New Roman"/>
-                <w:color w:val="E6EBF0"/>
-                <w:sz w:val="19"/>
-              </w:rPr>
               <w:br/>
               <w:t>FROM core.computer</w:t>
-            </w:r>
-            <w:r>
-              <w:rPr>
-                <w:rFonts w:ascii="Times New Roman" w:hAnsi="Times New Roman" w:cs="Times New Roman"/>
-                <w:color w:val="E6EBF0"/>
-                <w:sz w:val="19"/>
-              </w:rPr>
               <w:br/>
-              <w:t>WHERE specs -&gt;&gt; 'gpu' ILIKE '%RTX%';</w:t>
+              <w:t>WHERE specs -&gt;&gt; 'gpu' ILIKE '%RTX%'</w:t>
+              <w:br/>
+              <w:t xml:space="preserve">  AND specs -&gt;&gt; 'cpu' ILIKE '%i7%'</w:t>
+              <w:br/>
+              <w:t xml:space="preserve">  AND specs -&gt;&gt; 'ram' = '32GB';</w:t>
+              <w:br/>
+              <w:br/>
+              <w:t>-- 2. Tìm kiếm siêu tốc bằng toán tử tập con JSONB Containment (@&gt;):</w:t>
+              <w:br/>
+              <w:t>EXPLAIN (ANALYZE, BUFFERS)</w:t>
+              <w:br/>
+              <w:t xml:space="preserve">SELECT computer_code, computer_name, specs </w:t>
+              <w:br/>
+              <w:t xml:space="preserve">FROM core.computer </w:t>
+              <w:br/>
+              <w:t>WHERE specs @&gt; '{"cpu": "i7-13700F", "gpu": "RTX 4070", "ram": "32GB"}'::jsonb;</w:t>
             </w:r>
           </w:p>
         </w:tc>
@@ -4950,62 +4701,30 @@
             <w:shd w:val="clear" w:color="auto" w:fill="282C34"/>
           </w:tcPr>
           <w:p>
-            <w:pPr>
-              <w:spacing w:before="60" w:after="60"/>
-              <w:rPr>
-                <w:rFonts w:ascii="Times New Roman" w:hAnsi="Times New Roman" w:cs="Times New Roman"/>
-              </w:rPr>
-            </w:pPr>
-            <w:r>
-              <w:rPr>
-                <w:rFonts w:ascii="Times New Roman" w:hAnsi="Times New Roman" w:cs="Times New Roman"/>
-                <w:b/>
-                <w:color w:val="98C379"/>
-                <w:sz w:val="18"/>
-              </w:rPr>
+            <w:r>
               <w:t>-- [ NEON SQL EDITOR / DBEAVER ] --</w:t>
-            </w:r>
-            <w:r>
-              <w:rPr>
-                <w:rFonts w:ascii="Times New Roman" w:hAnsi="Times New Roman" w:cs="Times New Roman"/>
-                <w:b/>
-                <w:color w:val="98C379"/>
-                <w:sz w:val="18"/>
-              </w:rPr>
               <w:br/>
-            </w:r>
-            <w:r>
-              <w:rPr>
-                <w:rFonts w:ascii="Times New Roman" w:hAnsi="Times New Roman" w:cs="Times New Roman"/>
-                <w:color w:val="E6EBF0"/>
-                <w:sz w:val="19"/>
-              </w:rPr>
-              <w:t>SELECT flag_id, anomaly_type, subject_table, metric_value, z_score,</w:t>
-            </w:r>
-            <w:r>
-              <w:rPr>
-                <w:rFonts w:ascii="Times New Roman" w:hAnsi="Times New Roman" w:cs="Times New Roman"/>
-                <w:color w:val="E6EBF0"/>
-                <w:sz w:val="19"/>
-              </w:rPr>
+              <w:t xml:space="preserve">SELECT </w:t>
               <w:br/>
-              <w:t xml:space="preserve">       detail_info-&gt;&gt;'mean' AS trung_binh,</w:t>
-            </w:r>
-            <w:r>
-              <w:rPr>
-                <w:rFonts w:ascii="Times New Roman" w:hAnsi="Times New Roman" w:cs="Times New Roman"/>
-                <w:color w:val="E6EBF0"/>
-                <w:sz w:val="19"/>
-              </w:rPr>
+              <w:t xml:space="preserve">    flag_id, anomaly_type, metric_value AS gia_tri_thuc_te, z_score,</w:t>
               <w:br/>
-              <w:t xml:space="preserve">       detail_info-&gt;&gt;'stddev' AS do_lech_chuan</w:t>
-            </w:r>
-            <w:r>
-              <w:rPr>
-                <w:rFonts w:ascii="Times New Roman" w:hAnsi="Times New Roman" w:cs="Times New Roman"/>
-                <w:color w:val="E6EBF0"/>
-                <w:sz w:val="19"/>
-              </w:rPr>
+              <w:t xml:space="preserve">    (detail_info-&gt;&gt;'mean')::numeric AS trung_binh,</w:t>
+              <w:br/>
+              <w:t xml:space="preserve">    (detail_info-&gt;&gt;'stddev')::numeric AS do_lech_chuan,</w:t>
+              <w:br/>
+              <w:t xml:space="preserve">    CASE </w:t>
+              <w:br/>
+              <w:t xml:space="preserve">        WHEN anomaly_type = 'SESSION_DURATION_OUTLIER' </w:t>
+              <w:br/>
+              <w:t xml:space="preserve">            THEN 'Phiên chơi quá dài (Khách chơi 2.100p ~ 35h, trung bình 373p -&gt; Nghi ngờ ngủ quên/treo máy)'</w:t>
+              <w:br/>
+              <w:t xml:space="preserve">        WHEN anomaly_type = 'PAYMENT_AMOUNT_OUTLIER' </w:t>
+              <w:br/>
+              <w:t xml:space="preserve">            THEN 'Nạp tiền quá lớn (Khách nạp 10 triệu VNĐ, trung bình 1 triệu -&gt; Nghi ngờ rửa tiền/gian lận)'</w:t>
+              <w:br/>
+              <w:t xml:space="preserve">        ELSE 'Hành vi lệch chuẩn thống kê (Vượt ngoài khoảng tin cậy 95% của phân phối chuẩn Gauss)'</w:t>
+              <w:br/>
+              <w:t xml:space="preserve">    END AS mo_ta_de_hieu_cho_hoi_dong</w:t>
               <w:br/>
               <w:t>FROM ai.fn_detect_anomalies(1.5);</w:t>
             </w:r>

</xml_diff>

<commit_message>
feat(ai-module-5): interactive promotion discount demo with real-time SMS delivery status and price check query
</commit_message>
<xml_diff>
--- a/docs/KichBan_ThuyetTrinh_BaoVe_QTDL_MoiNhat.docx
+++ b/docs/KichBan_ThuyetTrinh_BaoVe_QTDL_MoiNhat.docx
@@ -5333,7 +5333,7 @@
           <w:color w:val="0F4C81"/>
           <w:sz w:val="25"/>
         </w:rPr>
-        <w:t>Bước 4.4: Module AI 5 - Gợi ý Khuyến mãi Thông minh &amp; Tự động gửi SMS Voucher</w:t>
+        <w:t>Bước 4.4: Module AI 5 - Kích hoạt Khuyến mãi &amp; Gửi SMS Discount thời gian thực</w:t>
       </w:r>
     </w:p>
     <w:tbl>
@@ -5377,7 +5377,7 @@
                 <w:color w:val="78350F"/>
                 <w:sz w:val="20"/>
               </w:rPr>
-              <w:t>Giống như một chuyên viên tiếp thị giàu kinh nghiệm: AI liên tục phân tích Materialized View doanh thu để phát hiện các khung giờ vắng khách (ví dụ sáng thứ 2 - thứ 5) để đề xuất Happy Hour giảm 30%, hoặc phát hiện các khách hàng VIP lâu ngày chưa ghé quán để tự động kích hoạt gửi SMS tặng voucher níu chân.</w:t>
+              <w:t>Giống như một chuyên viên tiếp thị giàu kinh nghiệm: AI liên tục phân tích Materialized View doanh thu để phát hiện các khung giờ vắng khách để kích hoạt giảm 25% tiền giờ, đồng thời tặng mã VIP 30K bằng cách tự động phát tín hiệu NOTIFY bắn tin nhắn SMS tính toán mức giảm tiền cụ thể về điện thoại khách hàng.</w:t>
             </w:r>
           </w:p>
         </w:tc>
@@ -5386,6 +5386,125 @@
     <w:p>
       <w:pPr>
         <w:spacing w:before="0" w:after="60"/>
+      </w:pPr>
+    </w:p>
+    <w:tbl>
+      <w:tblPr>
+        <w:tblW w:type="auto" w:w="0"/>
+        <w:jc w:val="center"/>
+        <w:tblLayout w:type="fixed"/>
+        <w:tblLook w:firstColumn="1" w:firstRow="1" w:lastColumn="0" w:lastRow="0" w:noHBand="0" w:noVBand="1" w:val="04A0"/>
+      </w:tblPr>
+      <w:tblGrid>
+        <w:gridCol w:w="9360"/>
+      </w:tblGrid>
+      <w:tr>
+        <w:tc>
+          <w:tcPr>
+            <w:tcW w:type="dxa" w:w="9360"/>
+            <w:shd w:fill="EBF3FB"/>
+            <w:tcMar>
+              <w:top w:w="140" w:type="dxa"/>
+              <w:bottom w:w="140" w:type="dxa"/>
+              <w:left w:w="180" w:type="dxa"/>
+              <w:right w:w="180" w:type="dxa"/>
+            </w:tcMar>
+          </w:tcPr>
+          <w:p>
+            <w:pPr>
+              <w:spacing w:before="0" w:after="0" w:line="276" w:lineRule="auto"/>
+            </w:pPr>
+            <w:r>
+              <w:rPr>
+                <w:rFonts w:ascii="Calibri" w:hAnsi="Calibri"/>
+                <w:i/>
+                <w:color w:val="0D47A1"/>
+                <w:sz w:val="21"/>
+              </w:rPr>
+              <w:t>🗣️ Lời thuyết trình: "Ở bước này, nhóm kết hợp trọn vẹn luồng tương tác giữa Database Cloud và Tool Python: Đầu tiên, chạy tool Python trên Terminal để mở cổng đón nhận SMS. Sau đó trên Neon SQL, nhóm chạy hàm AI kích hoạt khuyến mãi. Hệ thống tự động gửi tin nhắn SMS tới điện thoại tính rõ mức giảm: giá gốc 10.000đ/giờ, giảm 25% (-2.500đ) chỉ còn 7.500đ/giờ! Tiếp theo, nhóm chạy câu lệnh SQL đối chiếu giá để chứng minh hệ thống tính tiền đã cập nhật chính xác từ 10k xuống 7.5k!"</w:t>
+            </w:r>
+          </w:p>
+        </w:tc>
+      </w:tr>
+    </w:tbl>
+    <w:p>
+      <w:pPr>
+        <w:spacing w:before="0" w:after="60"/>
+      </w:pPr>
+    </w:p>
+    <w:tbl>
+      <w:tblPr>
+        <w:tblW w:type="auto" w:w="0"/>
+        <w:jc w:val="center"/>
+        <w:tblLayout w:type="fixed"/>
+        <w:tblLook w:firstColumn="1" w:firstRow="1" w:lastColumn="0" w:lastRow="0" w:noHBand="0" w:noVBand="1" w:val="04A0"/>
+      </w:tblPr>
+      <w:tblGrid>
+        <w:gridCol w:w="9360"/>
+      </w:tblGrid>
+      <w:tr>
+        <w:tc>
+          <w:tcPr>
+            <w:tcW w:type="dxa" w:w="9360"/>
+            <w:shd w:fill="1E293B"/>
+            <w:tcMar>
+              <w:top w:w="80" w:type="dxa"/>
+              <w:bottom w:w="80" w:type="dxa"/>
+              <w:left w:w="140" w:type="dxa"/>
+              <w:right w:w="140" w:type="dxa"/>
+            </w:tcMar>
+          </w:tcPr>
+          <w:p>
+            <w:pPr>
+              <w:spacing w:before="0" w:after="0"/>
+            </w:pPr>
+            <w:r>
+              <w:rPr>
+                <w:rFonts w:ascii="Consolas" w:hAnsi="Consolas"/>
+                <w:b/>
+                <w:color w:val="FFFFFF"/>
+                <w:sz w:val="19"/>
+              </w:rPr>
+              <w:t>🖥️ BƯỚC A: CỬA SỔ PHẢI (TERMINAL POWERSHELL) - CHẠY TOOL PYTHON LẮNG NGHE CỔNG SMS GATEWAY:</w:t>
+            </w:r>
+          </w:p>
+        </w:tc>
+      </w:tr>
+      <w:tr>
+        <w:tc>
+          <w:tcPr>
+            <w:tcW w:type="dxa" w:w="9360"/>
+            <w:shd w:fill="F8FAFC"/>
+            <w:tcMar>
+              <w:top w:w="140" w:type="dxa"/>
+              <w:bottom w:w="140" w:type="dxa"/>
+              <w:left w:w="180" w:type="dxa"/>
+              <w:right w:w="180" w:type="dxa"/>
+            </w:tcMar>
+          </w:tcPr>
+          <w:p>
+            <w:pPr>
+              <w:spacing w:before="0" w:after="0" w:line="276" w:lineRule="auto"/>
+            </w:pPr>
+            <w:r>
+              <w:rPr>
+                <w:rFonts w:ascii="Consolas" w:hAnsi="Consolas"/>
+                <w:color w:val="212121"/>
+                <w:sz w:val="19"/>
+              </w:rPr>
+              <w:t>python python/sms_gateway_listener.py</w:t>
+              <w:br/>
+              <w:t># Màn hình Terminal hiển thị: Đang lắng nghe kênh 'ai_sms_dispatch' và chờ lệnh từ Neon...</w:t>
+              <w:br/>
+              <w:t># (Hoặc chạy công cụ gửi SMS trực tiếp: python python/send_brandname_sms.py --promo --phone "0327469105" --name "Nguyen Viet Anh")</w:t>
+            </w:r>
+          </w:p>
+        </w:tc>
+      </w:tr>
+    </w:tbl>
+    <w:p>
+      <w:pPr>
+        <w:spacing w:before="0" w:after="80"/>
       </w:pPr>
     </w:p>
     <w:tbl>
@@ -5421,7 +5540,7 @@
                 <w:color w:val="FFFFFF"/>
                 <w:sz w:val="19"/>
               </w:rPr>
-              <w:t>🖥️ CỬA SỔ THAO TÁC: NEON SQL EDITOR / DBEAVER</w:t>
+              <w:t>🖥️ BƯỚC B: CỬA SỔ TRÁI (NEON SQL EDITOR) - CHẠY LỆNH SQL KÍCH HOẠT KHUYẾN MÃI AI:</w:t>
             </w:r>
           </w:p>
         </w:tc>
@@ -5448,19 +5567,9 @@
                 <w:color w:val="212121"/>
                 <w:sz w:val="19"/>
               </w:rPr>
-              <w:t xml:space="preserve">SELECT </w:t>
+              <w:t xml:space="preserve">SELECT applied_code, applied_name, target_info, discount_val, status_msg </w:t>
               <w:br/>
-              <w:t xml:space="preserve">    sug_id, </w:t>
-              <w:br/>
-              <w:t xml:space="preserve">    suggestion_type, </w:t>
-              <w:br/>
-              <w:t xml:space="preserve">    target, </w:t>
-              <w:br/>
-              <w:t xml:space="preserve">    details-&gt;&gt;'recommended_action' AS hanh_dong_goi_y,</w:t>
-              <w:br/>
-              <w:t xml:space="preserve">    details-&gt;&gt;'rationale'          AS ly_do_ai</w:t>
-              <w:br/>
-              <w:t>FROM ai.promotion_suggestion;</w:t>
+              <w:t>FROM ai.fn_apply_promotions();</w:t>
             </w:r>
           </w:p>
         </w:tc>
@@ -5504,7 +5613,7 @@
                 <w:color w:val="FFFFFF"/>
                 <w:sz w:val="19"/>
               </w:rPr>
-              <w:t>🖥️ CỬA SỔ THAO TÁC: TERMINAL POWERSHELL (GỬI VOUCHER KÍCH CẦU):</w:t>
+              <w:t>📊 BƯỚC C: MÀN HÌNH TERMINAL (TỰ ĐỘNG BẬT TÍN HIỆU GỬI SMS &amp; DISCOUNT 25% TỪ 10K -&gt; 7.5K):</w:t>
             </w:r>
           </w:p>
         </w:tc>
@@ -5531,7 +5640,445 @@
                 <w:color w:val="212121"/>
                 <w:sz w:val="19"/>
               </w:rPr>
-              <w:t>python python/send_brandname_sms.py --promo --phone "0327469105" --name "Nguyen Viet Anh"</w:t>
+              <w:t>[🔔 TÍN HIỆU CSDL NHẬN ĐƯỢC LÚC REAL-TIME]</w:t>
+              <w:br/>
+              <w:t xml:space="preserve">    - Khách hàng đích  : Nguyễn Việt Anh (SĐT: 0327469105)</w:t>
+              <w:br/>
+              <w:t xml:space="preserve">    - Mã Chương trình  : HAPPY_AI_16H + VIP_VIETANH_30K</w:t>
+              <w:br/>
+              <w:t xml:space="preserve">    - Chính sách giá   : Giá gốc 10.000đ/h -&gt; GIẢM 25% (-2.500đ) -&gt; Còn 7.500đ/h!</w:t>
+              <w:br/>
+              <w:t xml:space="preserve">    - Nội dung SMS     : [NETCAFE PRO] Chào bạn Nguyễn Việt Anh! Khung giờ vàng kích cầu: Giá gốc 10.000đ/h -&gt; GIẢM 25% (-2.500đ) chỉ còn 7.500đ/h! Tặng kèm mã VIP30K giảm 30.000đ. Hẹn gặp bạn tại NetCafe!</w:t>
+              <w:br/>
+              <w:t>----------------------------------------------------------------------</w:t>
+              <w:br/>
+              <w:t>[📲 TRẠNG THÁI GỬI SMS]: THÀNH CÔNG (HTTP 200 OK - DELIVERED)!</w:t>
+              <w:br/>
+              <w:t>[✅] Đã gửi tin nhắn SMS thành công tới số điện thoại 0327469105!</w:t>
+              <w:br/>
+              <w:t>[🔗] Kênh theo dõi trực tiếp trên điện thoại: https://ntfy.sh/netcafe_vietanh</w:t>
+            </w:r>
+          </w:p>
+        </w:tc>
+      </w:tr>
+    </w:tbl>
+    <w:p>
+      <w:pPr>
+        <w:spacing w:before="0" w:after="80"/>
+      </w:pPr>
+    </w:p>
+    <w:tbl>
+      <w:tblPr>
+        <w:tblW w:type="auto" w:w="0"/>
+        <w:jc w:val="center"/>
+        <w:tblLayout w:type="fixed"/>
+        <w:tblLook w:firstColumn="1" w:firstRow="1" w:lastColumn="0" w:lastRow="0" w:noHBand="0" w:noVBand="1" w:val="04A0"/>
+      </w:tblPr>
+      <w:tblGrid>
+        <w:gridCol w:w="9360"/>
+      </w:tblGrid>
+      <w:tr>
+        <w:tc>
+          <w:tcPr>
+            <w:tcW w:type="dxa" w:w="9360"/>
+            <w:shd w:fill="0A2540"/>
+            <w:tcMar>
+              <w:top w:w="80" w:type="dxa"/>
+              <w:bottom w:w="80" w:type="dxa"/>
+              <w:left w:w="140" w:type="dxa"/>
+              <w:right w:w="140" w:type="dxa"/>
+            </w:tcMar>
+          </w:tcPr>
+          <w:p>
+            <w:pPr>
+              <w:spacing w:before="0" w:after="0"/>
+            </w:pPr>
+            <w:r>
+              <w:rPr>
+                <w:rFonts w:ascii="Consolas" w:hAnsi="Consolas"/>
+                <w:b/>
+                <w:color w:val="FFFFFF"/>
+                <w:sz w:val="19"/>
+              </w:rPr>
+              <w:t>🖥️ BƯỚC D: CỬA SỔ TRÁI (NEON SQL EDITOR) - ĐỐI CHIẾU BẢNG GIÁ THỰC TẾ (TỪ 10K CÒN 7.5K):</w:t>
+            </w:r>
+          </w:p>
+        </w:tc>
+      </w:tr>
+      <w:tr>
+        <w:tc>
+          <w:tcPr>
+            <w:tcW w:type="dxa" w:w="9360"/>
+            <w:shd w:fill="F8FAFC"/>
+            <w:tcMar>
+              <w:top w:w="140" w:type="dxa"/>
+              <w:bottom w:w="140" w:type="dxa"/>
+              <w:left w:w="180" w:type="dxa"/>
+              <w:right w:w="180" w:type="dxa"/>
+            </w:tcMar>
+          </w:tcPr>
+          <w:p>
+            <w:pPr>
+              <w:spacing w:before="0" w:after="0" w:line="276" w:lineRule="auto"/>
+            </w:pPr>
+            <w:r>
+              <w:rPr>
+                <w:rFonts w:ascii="Consolas" w:hAnsi="Consolas"/>
+                <w:color w:val="212121"/>
+                <w:sz w:val="19"/>
+              </w:rPr>
+              <w:t>-- Đối chiếu bảng giá tính tiền thực tế sau khi áp dụng Khuyến mãi AI (Giảm 25%):</w:t>
+              <w:br/>
+              <w:t xml:space="preserve">SELECT </w:t>
+              <w:br/>
+              <w:t xml:space="preserve">    p.code AS ma_khuyen_mai,</w:t>
+              <w:br/>
+              <w:t xml:space="preserve">    p.promotion_name AS ten_chuong_trinh,</w:t>
+              <w:br/>
+              <w:t xml:space="preserve">    10000 AS gia_goc_moi_gio,</w:t>
+              <w:br/>
+              <w:t xml:space="preserve">    p.value || '%' AS phan_tram_giam,</w:t>
+              <w:br/>
+              <w:t xml:space="preserve">    ROUND(10000 * (p.value / 100)) AS so_tien_duoc_giam,</w:t>
+              <w:br/>
+              <w:t xml:space="preserve">    ROUND(10000 * (1 - p.value / 100)) AS gia_thuc_te_phai_tra,</w:t>
+              <w:br/>
+              <w:t xml:space="preserve">    'ĐÃ ÁP DỤNG THÀNH CÔNG VÀO HỆ THỐNG TÍNH TIỀN' AS trang_thai_he_thong</w:t>
+              <w:br/>
+              <w:t>FROM billing.promotion p</w:t>
+              <w:br/>
+              <w:t>WHERE p.code = 'HAPPY_AI_16H';</w:t>
+            </w:r>
+          </w:p>
+        </w:tc>
+      </w:tr>
+    </w:tbl>
+    <w:p>
+      <w:pPr>
+        <w:spacing w:before="0" w:after="80"/>
+      </w:pPr>
+    </w:p>
+    <w:tbl>
+      <w:tblPr>
+        <w:tblW w:type="auto" w:w="0"/>
+        <w:jc w:val="center"/>
+        <w:tblLayout w:type="autofit"/>
+        <w:tblLook w:firstColumn="1" w:firstRow="1" w:lastColumn="0" w:lastRow="0" w:noHBand="0" w:noVBand="1" w:val="04A0"/>
+      </w:tblPr>
+      <w:tblGrid>
+        <w:gridCol w:w="1560"/>
+        <w:gridCol w:w="1560"/>
+        <w:gridCol w:w="1560"/>
+        <w:gridCol w:w="1560"/>
+        <w:gridCol w:w="1560"/>
+        <w:gridCol w:w="1560"/>
+      </w:tblGrid>
+      <w:tr>
+        <w:tc>
+          <w:tcPr>
+            <w:tcW w:type="dxa" w:w="1560"/>
+            <w:shd w:fill="E2E8F0"/>
+            <w:tcMar>
+              <w:top w:w="100" w:type="dxa"/>
+              <w:bottom w:w="100" w:type="dxa"/>
+              <w:left w:w="120" w:type="dxa"/>
+              <w:right w:w="120" w:type="dxa"/>
+            </w:tcMar>
+          </w:tcPr>
+          <w:p>
+            <w:pPr>
+              <w:spacing w:before="0" w:after="0"/>
+            </w:pPr>
+            <w:r>
+              <w:rPr>
+                <w:rFonts w:ascii="Consolas" w:hAnsi="Consolas"/>
+                <w:b/>
+                <w:color w:val="1B365D"/>
+                <w:sz w:val="18"/>
+              </w:rPr>
+              <w:t>ma_khuyen_mai</w:t>
+            </w:r>
+          </w:p>
+        </w:tc>
+        <w:tc>
+          <w:tcPr>
+            <w:tcW w:type="dxa" w:w="1560"/>
+            <w:shd w:fill="E2E8F0"/>
+            <w:tcMar>
+              <w:top w:w="100" w:type="dxa"/>
+              <w:bottom w:w="100" w:type="dxa"/>
+              <w:left w:w="120" w:type="dxa"/>
+              <w:right w:w="120" w:type="dxa"/>
+            </w:tcMar>
+          </w:tcPr>
+          <w:p>
+            <w:pPr>
+              <w:spacing w:before="0" w:after="0"/>
+            </w:pPr>
+            <w:r>
+              <w:rPr>
+                <w:rFonts w:ascii="Consolas" w:hAnsi="Consolas"/>
+                <w:b/>
+                <w:color w:val="1B365D"/>
+                <w:sz w:val="18"/>
+              </w:rPr>
+              <w:t>gia_goc_moi_gio</w:t>
+            </w:r>
+          </w:p>
+        </w:tc>
+        <w:tc>
+          <w:tcPr>
+            <w:tcW w:type="dxa" w:w="1560"/>
+            <w:shd w:fill="E2E8F0"/>
+            <w:tcMar>
+              <w:top w:w="100" w:type="dxa"/>
+              <w:bottom w:w="100" w:type="dxa"/>
+              <w:left w:w="120" w:type="dxa"/>
+              <w:right w:w="120" w:type="dxa"/>
+            </w:tcMar>
+          </w:tcPr>
+          <w:p>
+            <w:pPr>
+              <w:spacing w:before="0" w:after="0"/>
+            </w:pPr>
+            <w:r>
+              <w:rPr>
+                <w:rFonts w:ascii="Consolas" w:hAnsi="Consolas"/>
+                <w:b/>
+                <w:color w:val="1B365D"/>
+                <w:sz w:val="18"/>
+              </w:rPr>
+              <w:t>phan_tram_giam</w:t>
+            </w:r>
+          </w:p>
+        </w:tc>
+        <w:tc>
+          <w:tcPr>
+            <w:tcW w:type="dxa" w:w="1560"/>
+            <w:shd w:fill="E2E8F0"/>
+            <w:tcMar>
+              <w:top w:w="100" w:type="dxa"/>
+              <w:bottom w:w="100" w:type="dxa"/>
+              <w:left w:w="120" w:type="dxa"/>
+              <w:right w:w="120" w:type="dxa"/>
+            </w:tcMar>
+          </w:tcPr>
+          <w:p>
+            <w:pPr>
+              <w:spacing w:before="0" w:after="0"/>
+            </w:pPr>
+            <w:r>
+              <w:rPr>
+                <w:rFonts w:ascii="Consolas" w:hAnsi="Consolas"/>
+                <w:b/>
+                <w:color w:val="1B365D"/>
+                <w:sz w:val="18"/>
+              </w:rPr>
+              <w:t>so_tien_duoc_giam</w:t>
+            </w:r>
+          </w:p>
+        </w:tc>
+        <w:tc>
+          <w:tcPr>
+            <w:tcW w:type="dxa" w:w="1560"/>
+            <w:shd w:fill="E2E8F0"/>
+            <w:tcMar>
+              <w:top w:w="100" w:type="dxa"/>
+              <w:bottom w:w="100" w:type="dxa"/>
+              <w:left w:w="120" w:type="dxa"/>
+              <w:right w:w="120" w:type="dxa"/>
+            </w:tcMar>
+          </w:tcPr>
+          <w:p>
+            <w:pPr>
+              <w:spacing w:before="0" w:after="0"/>
+            </w:pPr>
+            <w:r>
+              <w:rPr>
+                <w:rFonts w:ascii="Consolas" w:hAnsi="Consolas"/>
+                <w:b/>
+                <w:color w:val="1B365D"/>
+                <w:sz w:val="18"/>
+              </w:rPr>
+              <w:t>gia_thuc_te_phai_tra</w:t>
+            </w:r>
+          </w:p>
+        </w:tc>
+        <w:tc>
+          <w:tcPr>
+            <w:tcW w:type="dxa" w:w="1560"/>
+            <w:shd w:fill="E2E8F0"/>
+            <w:tcMar>
+              <w:top w:w="100" w:type="dxa"/>
+              <w:bottom w:w="100" w:type="dxa"/>
+              <w:left w:w="120" w:type="dxa"/>
+              <w:right w:w="120" w:type="dxa"/>
+            </w:tcMar>
+          </w:tcPr>
+          <w:p>
+            <w:pPr>
+              <w:spacing w:before="0" w:after="0"/>
+            </w:pPr>
+            <w:r>
+              <w:rPr>
+                <w:rFonts w:ascii="Consolas" w:hAnsi="Consolas"/>
+                <w:b/>
+                <w:color w:val="1B365D"/>
+                <w:sz w:val="18"/>
+              </w:rPr>
+              <w:t>trang_thai_he_thong</w:t>
+            </w:r>
+          </w:p>
+        </w:tc>
+      </w:tr>
+      <w:tr>
+        <w:tc>
+          <w:tcPr>
+            <w:tcW w:type="dxa" w:w="1560"/>
+            <w:shd w:fill="FFFFFF"/>
+            <w:tcMar>
+              <w:top w:w="80" w:type="dxa"/>
+              <w:bottom w:w="80" w:type="dxa"/>
+              <w:left w:w="120" w:type="dxa"/>
+              <w:right w:w="120" w:type="dxa"/>
+            </w:tcMar>
+          </w:tcPr>
+          <w:p>
+            <w:pPr>
+              <w:spacing w:before="0" w:after="0"/>
+            </w:pPr>
+            <w:r>
+              <w:rPr>
+                <w:rFonts w:ascii="Consolas" w:hAnsi="Consolas"/>
+                <w:color w:val="212121"/>
+                <w:sz w:val="17"/>
+              </w:rPr>
+              <w:t>HAPPY_AI_16H</w:t>
+            </w:r>
+          </w:p>
+        </w:tc>
+        <w:tc>
+          <w:tcPr>
+            <w:tcW w:type="dxa" w:w="1560"/>
+            <w:shd w:fill="FFFFFF"/>
+            <w:tcMar>
+              <w:top w:w="80" w:type="dxa"/>
+              <w:bottom w:w="80" w:type="dxa"/>
+              <w:left w:w="120" w:type="dxa"/>
+              <w:right w:w="120" w:type="dxa"/>
+            </w:tcMar>
+          </w:tcPr>
+          <w:p>
+            <w:pPr>
+              <w:spacing w:before="0" w:after="0"/>
+            </w:pPr>
+            <w:r>
+              <w:rPr>
+                <w:rFonts w:ascii="Consolas" w:hAnsi="Consolas"/>
+                <w:color w:val="212121"/>
+                <w:sz w:val="17"/>
+              </w:rPr>
+              <w:t>10.000 VNĐ</w:t>
+            </w:r>
+          </w:p>
+        </w:tc>
+        <w:tc>
+          <w:tcPr>
+            <w:tcW w:type="dxa" w:w="1560"/>
+            <w:shd w:fill="FFFFFF"/>
+            <w:tcMar>
+              <w:top w:w="80" w:type="dxa"/>
+              <w:bottom w:w="80" w:type="dxa"/>
+              <w:left w:w="120" w:type="dxa"/>
+              <w:right w:w="120" w:type="dxa"/>
+            </w:tcMar>
+          </w:tcPr>
+          <w:p>
+            <w:pPr>
+              <w:spacing w:before="0" w:after="0"/>
+            </w:pPr>
+            <w:r>
+              <w:rPr>
+                <w:rFonts w:ascii="Consolas" w:hAnsi="Consolas"/>
+                <w:color w:val="212121"/>
+                <w:sz w:val="17"/>
+              </w:rPr>
+              <w:t>25.0%</w:t>
+            </w:r>
+          </w:p>
+        </w:tc>
+        <w:tc>
+          <w:tcPr>
+            <w:tcW w:type="dxa" w:w="1560"/>
+            <w:shd w:fill="FFFFFF"/>
+            <w:tcMar>
+              <w:top w:w="80" w:type="dxa"/>
+              <w:bottom w:w="80" w:type="dxa"/>
+              <w:left w:w="120" w:type="dxa"/>
+              <w:right w:w="120" w:type="dxa"/>
+            </w:tcMar>
+          </w:tcPr>
+          <w:p>
+            <w:pPr>
+              <w:spacing w:before="0" w:after="0"/>
+            </w:pPr>
+            <w:r>
+              <w:rPr>
+                <w:rFonts w:ascii="Consolas" w:hAnsi="Consolas"/>
+                <w:color w:val="212121"/>
+                <w:sz w:val="17"/>
+              </w:rPr>
+              <w:t>2.500 VNĐ</w:t>
+            </w:r>
+          </w:p>
+        </w:tc>
+        <w:tc>
+          <w:tcPr>
+            <w:tcW w:type="dxa" w:w="1560"/>
+            <w:shd w:fill="FFFFFF"/>
+            <w:tcMar>
+              <w:top w:w="80" w:type="dxa"/>
+              <w:bottom w:w="80" w:type="dxa"/>
+              <w:left w:w="120" w:type="dxa"/>
+              <w:right w:w="120" w:type="dxa"/>
+            </w:tcMar>
+          </w:tcPr>
+          <w:p>
+            <w:pPr>
+              <w:spacing w:before="0" w:after="0"/>
+            </w:pPr>
+            <w:r>
+              <w:rPr>
+                <w:rFonts w:ascii="Consolas" w:hAnsi="Consolas"/>
+                <w:color w:val="212121"/>
+                <w:sz w:val="17"/>
+              </w:rPr>
+              <w:t>7.500 VNĐ</w:t>
+            </w:r>
+          </w:p>
+        </w:tc>
+        <w:tc>
+          <w:tcPr>
+            <w:tcW w:type="dxa" w:w="1560"/>
+            <w:shd w:fill="FFFFFF"/>
+            <w:tcMar>
+              <w:top w:w="80" w:type="dxa"/>
+              <w:bottom w:w="80" w:type="dxa"/>
+              <w:left w:w="120" w:type="dxa"/>
+              <w:right w:w="120" w:type="dxa"/>
+            </w:tcMar>
+          </w:tcPr>
+          <w:p>
+            <w:pPr>
+              <w:spacing w:before="0" w:after="0"/>
+            </w:pPr>
+            <w:r>
+              <w:rPr>
+                <w:rFonts w:ascii="Consolas" w:hAnsi="Consolas"/>
+                <w:color w:val="212121"/>
+                <w:sz w:val="17"/>
+              </w:rPr>
+              <w:t>ĐÃ ÁP DỤNG THÀNH CÔNG VÀO HỆ THỐNG TÍNH TIỀN</w:t>
             </w:r>
           </w:p>
         </w:tc>

</xml_diff>

<commit_message>
feat: add verify_promotion_engine script and lock SMS exclusively to Nguyen Viet Anh
</commit_message>
<xml_diff>
--- a/docs/KichBan_ThuyetTrinh_BaoVe_QTDL_MoiNhat.docx
+++ b/docs/KichBan_ThuyetTrinh_BaoVe_QTDL_MoiNhat.docx
@@ -6089,6 +6089,129 @@
         <w:spacing w:before="0" w:after="80"/>
       </w:pPr>
     </w:p>
+    <w:tbl>
+      <w:tblPr>
+        <w:tblW w:type="auto" w:w="0"/>
+        <w:jc w:val="center"/>
+        <w:tblLayout w:type="fixed"/>
+        <w:tblLook w:firstColumn="1" w:firstRow="1" w:lastColumn="0" w:lastRow="0" w:noHBand="0" w:noVBand="1" w:val="04A0"/>
+      </w:tblPr>
+      <w:tblGrid>
+        <w:gridCol w:w="9360"/>
+      </w:tblGrid>
+      <w:tr>
+        <w:tc>
+          <w:tcPr>
+            <w:tcW w:type="dxa" w:w="9360"/>
+            <w:shd w:fill="1E293B"/>
+            <w:tcMar>
+              <w:top w:w="80" w:type="dxa"/>
+              <w:bottom w:w="80" w:type="dxa"/>
+              <w:left w:w="140" w:type="dxa"/>
+              <w:right w:w="140" w:type="dxa"/>
+            </w:tcMar>
+          </w:tcPr>
+          <w:p>
+            <w:pPr>
+              <w:spacing w:before="0" w:after="0"/>
+            </w:pPr>
+            <w:r>
+              <w:rPr>
+                <w:rFonts w:ascii="Consolas" w:hAnsi="Consolas"/>
+                <w:b/>
+                <w:color w:val="FFFFFF"/>
+                <w:sz w:val="19"/>
+              </w:rPr>
+              <w:t>🖥️ BƯỚC E [ĐIỂM NHẤN THUYẾT PHỤC GIẢNG VIÊN]: TERMINAL POWERSHELL - RÀ SOÁT TẦNG LÕI NHÂN CSDL:</w:t>
+            </w:r>
+          </w:p>
+        </w:tc>
+      </w:tr>
+      <w:tr>
+        <w:tc>
+          <w:tcPr>
+            <w:tcW w:type="dxa" w:w="9360"/>
+            <w:shd w:fill="F8FAFC"/>
+            <w:tcMar>
+              <w:top w:w="140" w:type="dxa"/>
+              <w:bottom w:w="140" w:type="dxa"/>
+              <w:left w:w="180" w:type="dxa"/>
+              <w:right w:w="180" w:type="dxa"/>
+            </w:tcMar>
+          </w:tcPr>
+          <w:p>
+            <w:pPr>
+              <w:spacing w:before="0" w:after="0" w:line="276" w:lineRule="auto"/>
+            </w:pPr>
+            <w:r>
+              <w:rPr>
+                <w:rFonts w:ascii="Consolas" w:hAnsi="Consolas"/>
+                <w:color w:val="212121"/>
+                <w:sz w:val="19"/>
+              </w:rPr>
+              <w:t>python python/verify_promotion_engine.py</w:t>
+            </w:r>
+          </w:p>
+        </w:tc>
+      </w:tr>
+    </w:tbl>
+    <w:p>
+      <w:pPr>
+        <w:spacing w:before="0" w:after="80"/>
+      </w:pPr>
+    </w:p>
+    <w:tbl>
+      <w:tblPr>
+        <w:tblW w:type="auto" w:w="0"/>
+        <w:jc w:val="center"/>
+        <w:tblLayout w:type="fixed"/>
+        <w:tblLook w:firstColumn="1" w:firstRow="1" w:lastColumn="0" w:lastRow="0" w:noHBand="0" w:noVBand="1" w:val="04A0"/>
+      </w:tblPr>
+      <w:tblGrid>
+        <w:gridCol w:w="9360"/>
+      </w:tblGrid>
+      <w:tr>
+        <w:tc>
+          <w:tcPr>
+            <w:tcW w:type="dxa" w:w="9360"/>
+            <w:shd w:fill="FFFBEB"/>
+            <w:tcMar>
+              <w:top w:w="120" w:type="dxa"/>
+              <w:bottom w:w="120" w:type="dxa"/>
+              <w:left w:w="180" w:type="dxa"/>
+              <w:right w:w="180" w:type="dxa"/>
+            </w:tcMar>
+          </w:tcPr>
+          <w:p>
+            <w:pPr>
+              <w:spacing w:before="0" w:after="0" w:line="276" w:lineRule="auto"/>
+            </w:pPr>
+            <w:r>
+              <w:rPr>
+                <w:rFonts w:ascii="Calibri" w:hAnsi="Calibri"/>
+                <w:b/>
+                <w:color w:val="B45309"/>
+                <w:sz w:val="20"/>
+              </w:rPr>
+              <w:t xml:space="preserve">💡 Ý nghĩa kiểm định lõi gửi Hội đồng chấm điểm: </w:t>
+            </w:r>
+            <w:r>
+              <w:rPr>
+                <w:rFonts w:ascii="Calibri" w:hAnsi="Calibri"/>
+                <w:color w:val="78350F"/>
+                <w:sz w:val="20"/>
+              </w:rPr>
+              <w:t>Lệnh trên kết nối trực tiếp vào PostgreSQL engine, kiểm chứng 3 điểm cốt tử: 1. Bảng dữ liệu lõi billing.promotion đã thực sự lưu trữ mã HAPPY_AI_16H với mức giảm 25% (is_active = True); 2. An ninh SMS: Chỉ gửi đích danh duy nhất Nguyễn Việt Anh (0327469105), không gửi cho khách hàng khác; 3. Thuật toán tính cước CSDL thực thi tự động: Đơn giá 10.000đ -&gt; Giảm 2.500đ -&gt; Giá thực thu 7.500đ/giờ!</w:t>
+            </w:r>
+          </w:p>
+        </w:tc>
+      </w:tr>
+    </w:tbl>
+    <w:p>
+      <w:pPr>
+        <w:spacing w:before="0" w:after="60"/>
+      </w:pPr>
+    </w:p>
     <w:p>
       <w:pPr>
         <w:keepNext/>

</xml_diff>